<commit_message>
Add MOA execution date (2025/8/29) to all v2 documents
Updated 5 v2 governance documents with explicit MOA date reference:
- 03_出向契約書_표준안_v2.docx: Article 1 (出向の目的)
- 01_AMNG_雇用契約書_박수아관장_v2.docx: Article 13 (利益相反)
- 01_AMNG_雇用契約書_표준안_v2.docx: Article 13 (利益相反)
- 02_AMNG_就業規則_표준안_v2.docx: Article 31 (利益相反·情報管理)
- 00_사전공유_커버메모.docx: Background and document overview

Added phrase: "2025年8月29日付 AMNG MOA (合意覚書)"

Source: CH (Chunichi Shimbun) loan agreement draft references
"2025年8月29日に締結した合意覚書"

Replaced previous zip with consolidated single zip:
- AMNG_거버넌스_문서_v2_최신.zip (5 documents bundled)

https://claude.ai/code/session_01Qkw4gcrAJp5wzQK1hhc38B
</commit_message>
<xml_diff>
--- a/amng_governance_docs/00_사전공유_커버메모.docx
+++ b/amng_governance_docs/00_사전공유_커버메모.docx
@@ -88,7 +88,7 @@
           <w:sz w:val="21"/>
           <w:rFonts w:eastAsia="ＭＳ 明朝"/>
         </w:rPr>
-        <w:t>본 자료는 2026. 6. 4. 개최된 AMNG 이사회에서 지적된 "AMNG 내 고용계약·취업규칙 부재" 사항에 대응하여, 법무·컴플라이언스 본부에서 정비한 거버넌스 문서 표준안 3종입니다.</w:t>
+        <w:t>본 자료는 2025년 8월 29일자 AMNG MOA(合意覚書) 및 2026. 6. 4. 개최된 AMNG 이사회에서 지적된 "AMNG 내 고용계약·취업규칙 부재" 사항에 대응하여, 법무·컴플라이언스 본부에서 정비한 거버넌스 문서 표준안 3종입니다.</w:t>
       </w:r>
     </w:p>
     <w:p/>
@@ -298,7 +298,7 @@
           <w:sz w:val="21"/>
           <w:rFonts w:eastAsia="ＭＳ 明朝"/>
         </w:rPr>
-        <w:t xml:space="preserve">  · 법적 근거: 日本 労働契約法 第14条 (출향 명령) / AMNG MOA 제7조 제2항</w:t>
+        <w:t xml:space="preserve">  · 법적 근거: 日本 労働契約法 第14条 (출향 명령) / 2025년 8월 29일자 AMNG MOA 제7조 제2항</w:t>
       </w:r>
     </w:p>
     <w:p>

</xml_diff>